<commit_message>
add layout and chapter 6
</commit_message>
<xml_diff>
--- a/packages/chapters/introduction_v2.docx
+++ b/packages/chapters/introduction_v2.docx
@@ -3,15 +3,12 @@
 <w:document xmlns:wpc="http://schemas.microsoft.com/office/word/2010/wordprocessingCanvas" xmlns:cx="http://schemas.microsoft.com/office/drawing/2014/chartex" xmlns:cx1="http://schemas.microsoft.com/office/drawing/2015/9/8/chartex" xmlns:cx2="http://schemas.microsoft.com/office/drawing/2015/10/21/chartex" xmlns:cx3="http://schemas.microsoft.com/office/drawing/2016/5/9/chartex" xmlns:cx4="http://schemas.microsoft.com/office/drawing/2016/5/10/chartex" xmlns:cx5="http://schemas.microsoft.com/office/drawing/2016/5/11/chartex" xmlns:cx6="http://schemas.microsoft.com/office/drawing/2016/5/12/chartex" xmlns:cx7="http://schemas.microsoft.com/office/drawing/2016/5/13/chartex" xmlns:cx8="http://schemas.microsoft.com/office/drawing/2016/5/14/chartex" xmlns:mc="http://schemas.openxmlformats.org/markup-compatibility/2006" xmlns:aink="http://schemas.microsoft.com/office/drawing/2016/ink" xmlns:am3d="http://schemas.microsoft.com/office/drawing/2017/model3d" xmlns:o="urn:schemas-microsoft-com:office:office" xmlns:oel="http://schemas.microsoft.com/office/2019/extlst" xmlns:r="http://schemas.openxmlformats.org/officeDocument/2006/relationships" xmlns:m="http://schemas.openxmlformats.org/officeDocument/2006/math" xmlns:v="urn:schemas-microsoft-com:vml" xmlns:wp14="http://schemas.microsoft.com/office/word/2010/wordprocessingDrawing" xmlns:wp="http://schemas.openxmlformats.org/drawingml/2006/wordprocessingDrawing" xmlns:w10="urn:schemas-microsoft-com:office:word" xmlns:w="http://schemas.openxmlformats.org/wordprocessingml/2006/main" xmlns:w14="http://schemas.microsoft.com/office/word/2010/wordml" xmlns:w15="http://schemas.microsoft.com/office/word/2012/wordml" xmlns:w16cex="http://schemas.microsoft.com/office/word/2018/wordml/cex" xmlns:w16cid="http://schemas.microsoft.com/office/word/2016/wordml/cid" xmlns:w16="http://schemas.microsoft.com/office/word/2018/wordml" xmlns:w16du="http://schemas.microsoft.com/office/word/2023/wordml/word16du" xmlns:w16sdtdh="http://schemas.microsoft.com/office/word/2020/wordml/sdtdatahash" xmlns:w16sdtfl="http://schemas.microsoft.com/office/word/2024/wordml/sdtformatlock" xmlns:w16se="http://schemas.microsoft.com/office/word/2015/wordml/symex" xmlns:wpg="http://schemas.microsoft.com/office/word/2010/wordprocessingGroup" xmlns:wpi="http://schemas.microsoft.com/office/word/2010/wordprocessingInk" xmlns:wne="http://schemas.microsoft.com/office/word/2006/wordml" xmlns:wps="http://schemas.microsoft.com/office/word/2010/wordprocessingShape" mc:Ignorable="w14 w15 w16se w16cid w16 w16cex w16sdtdh w16sdtfl w16du wp14">
   <w:body>
     <w:p>
-      <w:pPr>
-        <w:spacing w:after="240"/>
-      </w:pPr>
       <w:r>
         <w:rPr>
           <w:noProof/>
         </w:rPr>
         <w:drawing>
-          <wp:inline distT="0" distB="0" distL="0" distR="0" wp14:anchorId="759248F8" wp14:editId="4CA86EE7">
+          <wp:inline distT="0" distB="0" distL="0" distR="0" wp14:anchorId="759248F8" wp14:editId="5F91F613">
             <wp:extent cx="5731510" cy="2730500"/>
             <wp:effectExtent l="0" t="0" r="2540" b="0"/>
             <wp:docPr id="1577075015" name="Image 1"/>
@@ -54,599 +51,388 @@
       </w:r>
     </w:p>
     <w:p>
-      <w:pPr>
-        <w:spacing w:after="80"/>
-      </w:pPr>
-      <w:r>
-        <w:rPr>
-          <w:rFonts w:ascii="Arial" w:eastAsia="Arial" w:hAnsi="Arial" w:cs="Arial"/>
-          <w:color w:val="2E6DA4"/>
-        </w:rPr>
+      <w:r>
         <w:t>Introduction</w:t>
       </w:r>
     </w:p>
     <w:p>
-      <w:pPr>
-        <w:spacing w:after="160"/>
-      </w:pPr>
-      <w:r>
-        <w:rPr>
-          <w:rFonts w:ascii="Arial" w:eastAsia="Arial" w:hAnsi="Arial" w:cs="Arial"/>
-          <w:b/>
-          <w:bCs/>
-          <w:color w:val="1A3A5C"/>
+      <w:r>
+        <w:rPr>
           <w:sz w:val="44"/>
           <w:szCs w:val="44"/>
         </w:rPr>
         <w:t>L'interface qui vous comprend</w:t>
       </w:r>
       <w:r>
-        <w:rPr>
-          <w:rFonts w:ascii="Arial" w:eastAsia="Arial" w:hAnsi="Arial" w:cs="Arial"/>
-          <w:b/>
-          <w:bCs/>
-          <w:color w:val="1A3A5C"/>
-          <w:sz w:val="40"/>
-          <w:szCs w:val="40"/>
-        </w:rPr>
         <w:t xml:space="preserve"> The Interface That </w:t>
       </w:r>
       <w:proofErr w:type="spellStart"/>
       <w:r>
-        <w:rPr>
-          <w:rFonts w:ascii="Arial" w:eastAsia="Arial" w:hAnsi="Arial" w:cs="Arial"/>
-          <w:b/>
-          <w:bCs/>
-          <w:color w:val="1A3A5C"/>
-          <w:sz w:val="40"/>
-          <w:szCs w:val="40"/>
-        </w:rPr>
         <w:t>Understands</w:t>
       </w:r>
       <w:proofErr w:type="spellEnd"/>
       <w:r>
-        <w:rPr>
-          <w:rFonts w:ascii="Arial" w:eastAsia="Arial" w:hAnsi="Arial" w:cs="Arial"/>
-          <w:b/>
-          <w:bCs/>
-          <w:color w:val="1A3A5C"/>
-          <w:sz w:val="40"/>
-          <w:szCs w:val="40"/>
-        </w:rPr>
         <w:t xml:space="preserve"> You</w:t>
       </w:r>
     </w:p>
-    <w:p>
-      <w:pPr>
-        <w:pBdr>
-          <w:bottom w:val="single" w:sz="6" w:space="1" w:color="2E6DA4"/>
-        </w:pBdr>
-        <w:spacing w:after="240"/>
-      </w:pPr>
-    </w:p>
-    <w:p>
-      <w:pPr>
-        <w:spacing w:before="480" w:after="120"/>
-      </w:pPr>
-      <w:r>
-        <w:rPr>
-          <w:rFonts w:ascii="Arial" w:eastAsia="Arial" w:hAnsi="Arial" w:cs="Arial"/>
+    <w:p/>
+    <w:p>
+      <w:pPr>
+        <w:rPr>
+          <w:rFonts w:eastAsia="Arial"/>
           <w:b/>
           <w:bCs/>
           <w:color w:val="2E6DA4"/>
           <w:sz w:val="20"/>
           <w:szCs w:val="20"/>
         </w:rPr>
-        <w:t xml:space="preserve">── FR — Français </w:t>
-      </w:r>
-      <w:r>
-        <w:rPr>
-          <w:rFonts w:ascii="Courier New" w:eastAsia="Courier New" w:hAnsi="Courier New" w:cs="Courier New"/>
-          <w:color w:val="BBBBBB"/>
-          <w:sz w:val="16"/>
-          <w:szCs w:val="16"/>
-        </w:rPr>
-        <w:t>───────────────────────────────────────────────────────</w:t>
-      </w:r>
-    </w:p>
-    <w:p>
-      <w:pPr>
-        <w:spacing w:after="120"/>
-      </w:pPr>
-    </w:p>
-    <w:p>
-      <w:pPr>
-        <w:spacing w:after="180"/>
-      </w:pPr>
-      <w:r>
-        <w:rPr>
-          <w:i/>
-          <w:iCs/>
-          <w:color w:val="444444"/>
-        </w:rPr>
-        <w:t>Quelque part en orbite lunaire basse, le vaisseau Babylon effectue sa dernière révolution autour du Shackleton avant le retour sur Terre.</w:t>
-      </w:r>
-    </w:p>
-    <w:p>
-      <w:pPr>
-        <w:spacing w:before="60"/>
-      </w:pPr>
-    </w:p>
-    <w:p>
-      <w:pPr>
-        <w:spacing w:after="180"/>
-      </w:pPr>
-      <w:r>
-        <w:t>À son bord, une IA de navigation surveille le flux de données géospatiales. Sur les écrans, la surface lunaire défile en tuiles 3D — altimétrie laser, imagerie multispectrale, modèles de terrains acquis par les missions LROC et SELENE. L'IA ne voit pas des images. Elle voit des coordonnées, des altitudes, des vecteurs normaux. Elle navigue dans un espace de données.</w:t>
-      </w:r>
-    </w:p>
-    <w:p>
-      <w:pPr>
-        <w:spacing w:after="180"/>
-      </w:pPr>
-      <w:r>
-        <w:t xml:space="preserve">Ce livre raconte comment construire cet espace. Pas pour un vaisseau spatial — pour votre navigateur web. Avec </w:t>
-      </w:r>
-      <w:proofErr w:type="spellStart"/>
-      <w:r>
-        <w:t>BabylonJS</w:t>
-      </w:r>
-      <w:proofErr w:type="spellEnd"/>
-      <w:r>
-        <w:t>, des données géospatiales réelles, et un protocole qui permet à un LLM de piloter le tout en langage naturel.</w:t>
-      </w:r>
-    </w:p>
-    <w:p>
-      <w:pPr>
-        <w:spacing w:before="120"/>
-      </w:pPr>
-    </w:p>
-    <w:p>
-      <w:pPr>
-        <w:pStyle w:val="Titre2"/>
-      </w:pPr>
-      <w:r>
-        <w:t>Ce que vous allez construire</w:t>
-      </w:r>
-    </w:p>
-    <w:p>
-      <w:pPr>
-        <w:spacing w:after="180"/>
-      </w:pPr>
-      <w:r>
-        <w:t xml:space="preserve">Une interface 3D géospatiale pilotée par IA. Concrètement : une scène </w:t>
-      </w:r>
-      <w:proofErr w:type="spellStart"/>
-      <w:r>
-        <w:t>BabylonJS</w:t>
-      </w:r>
-      <w:proofErr w:type="spellEnd"/>
-      <w:r>
-        <w:t xml:space="preserve"> qui charge des données terrain réelles (DEM, tuiles 3D, métadonnées OSM), exposée à un LLM via le Model </w:t>
-      </w:r>
-      <w:proofErr w:type="spellStart"/>
-      <w:r>
-        <w:t>Context</w:t>
-      </w:r>
-      <w:proofErr w:type="spellEnd"/>
-      <w:r>
-        <w:t xml:space="preserve"> Protocol. L'opérateur tape « survole la base lunaire de Shackleton à 500 mètres d'altitude » — la caméra se déplace.</w:t>
-      </w:r>
-    </w:p>
-    <w:p>
-      <w:pPr>
-        <w:spacing w:after="180"/>
-      </w:pPr>
-      <w:r>
-        <w:t xml:space="preserve">Le LLM n'a pas accès au moteur 3D. Il ne voit pas la scène. Il reçoit une grammaire — un ensemble de </w:t>
-      </w:r>
-      <w:proofErr w:type="spellStart"/>
-      <w:r>
-        <w:t>tools</w:t>
-      </w:r>
-      <w:proofErr w:type="spellEnd"/>
-      <w:r>
-        <w:t xml:space="preserve"> et </w:t>
-      </w:r>
-      <w:proofErr w:type="spellStart"/>
-      <w:r>
-        <w:t>resources</w:t>
-      </w:r>
-      <w:proofErr w:type="spellEnd"/>
-      <w:r>
-        <w:t xml:space="preserve"> MCP — et il l'utilise pour traduire des intentions en opérations concrètes. C'est cette grammaire que vous allez écrire.</w:t>
-      </w:r>
-    </w:p>
-    <w:p>
-      <w:pPr>
-        <w:spacing w:before="120"/>
-      </w:pPr>
-    </w:p>
-    <w:p>
-      <w:pPr>
-        <w:pStyle w:val="Titre2"/>
-      </w:pPr>
-      <w:r>
-        <w:t>L'implémentation réelle</w:t>
-      </w:r>
-    </w:p>
-    <w:p>
-      <w:pPr>
-        <w:spacing w:after="180"/>
-      </w:pPr>
-      <w:r>
-        <w:t xml:space="preserve">Ce livre s'ancre dans une implémentation open source existante : </w:t>
-      </w:r>
-      <w:proofErr w:type="spellStart"/>
-      <w:r>
-        <w:t>mcp</w:t>
-      </w:r>
-      <w:proofErr w:type="spellEnd"/>
-      <w:r>
-        <w:t>-for-</w:t>
-      </w:r>
-      <w:proofErr w:type="spellStart"/>
-      <w:r>
-        <w:t>babylon</w:t>
-      </w:r>
-      <w:proofErr w:type="spellEnd"/>
-      <w:r>
-        <w:t xml:space="preserve"> (github.com/</w:t>
-      </w:r>
-      <w:proofErr w:type="spellStart"/>
-      <w:r>
-        <w:t>pandaGaume</w:t>
-      </w:r>
-      <w:proofErr w:type="spellEnd"/>
-      <w:r>
-        <w:t>/</w:t>
-      </w:r>
-      <w:proofErr w:type="spellStart"/>
-      <w:r>
-        <w:t>mcp</w:t>
-      </w:r>
-      <w:proofErr w:type="spellEnd"/>
-      <w:r>
-        <w:t>-for-</w:t>
-      </w:r>
-      <w:proofErr w:type="spellStart"/>
-      <w:r>
-        <w:t>babylon</w:t>
-      </w:r>
-      <w:proofErr w:type="spellEnd"/>
-      <w:r>
-        <w:t>, Apache 2.0). Nous lisons le code, nous en comprenons l'architecture, et nous l'étendons au domaine géospatial.</w:t>
-      </w:r>
-    </w:p>
-    <w:p>
-      <w:pPr>
-        <w:spacing w:after="180"/>
-      </w:pPr>
-      <w:r>
-        <w:t xml:space="preserve">La phrase centrale du livre : le LLM est le </w:t>
-      </w:r>
-      <w:proofErr w:type="spellStart"/>
-      <w:r>
-        <w:t>parser</w:t>
-      </w:r>
-      <w:proofErr w:type="spellEnd"/>
-      <w:r>
-        <w:t>. Vous écrivez la grammaire.</w:t>
-      </w:r>
-    </w:p>
-    <w:p>
-      <w:pPr>
-        <w:spacing w:before="120"/>
-      </w:pPr>
-    </w:p>
-    <w:p>
-      <w:pPr>
-        <w:pStyle w:val="Titre2"/>
-      </w:pPr>
-      <w:r>
-        <w:t>Structure du livre</w:t>
-      </w:r>
-    </w:p>
-    <w:p>
-      <w:pPr>
-        <w:spacing w:after="180"/>
-      </w:pPr>
-      <w:r>
-        <w:t xml:space="preserve">Partie I — Fondations : les données géospatiales (ch.1), </w:t>
-      </w:r>
-      <w:proofErr w:type="spellStart"/>
-      <w:r>
-        <w:t>BabylonJS</w:t>
-      </w:r>
-      <w:proofErr w:type="spellEnd"/>
-      <w:r>
-        <w:t xml:space="preserve"> comme </w:t>
-      </w:r>
-      <w:proofErr w:type="spellStart"/>
-      <w:r>
-        <w:t>canvas</w:t>
-      </w:r>
-      <w:proofErr w:type="spellEnd"/>
-      <w:r>
-        <w:t xml:space="preserve"> (ch.2), MCP comme protocole (ch.3). Partie II — Architecture </w:t>
-      </w:r>
-      <w:proofErr w:type="spellStart"/>
-      <w:r>
-        <w:t>Behavior</w:t>
-      </w:r>
-      <w:proofErr w:type="spellEnd"/>
-      <w:r>
-        <w:t xml:space="preserve">/Adapter : le browser comme serveur MCP (ch.4), le pattern </w:t>
-      </w:r>
-      <w:proofErr w:type="spellStart"/>
-      <w:r>
-        <w:t>Behavior</w:t>
-      </w:r>
-      <w:proofErr w:type="spellEnd"/>
-      <w:r>
-        <w:t xml:space="preserve"> (ch.5), le pattern Adapter (ch.6). Partie III — Extension géospatiale : </w:t>
-      </w:r>
-      <w:proofErr w:type="spellStart"/>
-      <w:r>
-        <w:t>TerrainBehavior</w:t>
-      </w:r>
-      <w:proofErr w:type="spellEnd"/>
-      <w:r>
-        <w:t xml:space="preserve"> (ch.7), </w:t>
-      </w:r>
-      <w:proofErr w:type="spellStart"/>
-      <w:r>
-        <w:t>CesiumTerrainBehavior</w:t>
-      </w:r>
-      <w:proofErr w:type="spellEnd"/>
-      <w:r>
-        <w:t xml:space="preserve"> (ch.8), </w:t>
-      </w:r>
-      <w:proofErr w:type="spellStart"/>
-      <w:r>
-        <w:t>behaviors</w:t>
-      </w:r>
-      <w:proofErr w:type="spellEnd"/>
-      <w:r>
-        <w:t xml:space="preserve"> avancés (ch.9). Partie IV — Cas d'usage (ch.10–12).</w:t>
-      </w:r>
-    </w:p>
-    <w:p>
-      <w:pPr>
-        <w:spacing w:before="240"/>
-      </w:pPr>
-    </w:p>
-    <w:p>
-      <w:pPr>
-        <w:pBdr>
-          <w:bottom w:val="single" w:sz="6" w:space="1" w:color="2E6DA4"/>
-        </w:pBdr>
-        <w:spacing w:after="240"/>
-      </w:pPr>
-    </w:p>
-    <w:p>
-      <w:pPr>
-        <w:spacing w:before="480" w:after="120"/>
-      </w:pPr>
-      <w:r>
-        <w:rPr>
-          <w:rFonts w:ascii="Arial" w:eastAsia="Arial" w:hAnsi="Arial" w:cs="Arial"/>
+      </w:pPr>
+      <w:r>
+        <w:rPr>
+          <w:rFonts w:eastAsia="Arial"/>
           <w:b/>
           <w:bCs/>
           <w:color w:val="2E6DA4"/>
           <w:sz w:val="20"/>
           <w:szCs w:val="20"/>
         </w:rPr>
-        <w:t xml:space="preserve">── EN — English </w:t>
-      </w:r>
-      <w:r>
-        <w:rPr>
-          <w:rFonts w:ascii="Courier New" w:eastAsia="Courier New" w:hAnsi="Courier New" w:cs="Courier New"/>
-          <w:color w:val="BBBBBB"/>
-          <w:sz w:val="16"/>
-          <w:szCs w:val="16"/>
-        </w:rPr>
-        <w:t>───────────────────────────────────────────────────────</w:t>
-      </w:r>
-    </w:p>
-    <w:p>
-      <w:pPr>
-        <w:spacing w:after="120"/>
-      </w:pPr>
-    </w:p>
-    <w:p>
-      <w:pPr>
-        <w:spacing w:after="180"/>
-      </w:pPr>
-      <w:proofErr w:type="spellStart"/>
-      <w:r>
-        <w:rPr>
-          <w:i/>
-          <w:iCs/>
-          <w:color w:val="444444"/>
-        </w:rPr>
+        <w:t>── FR — Français</w:t>
+      </w:r>
+    </w:p>
+    <w:p>
+      <w:r>
+        <w:t>─────────────────────────────────────────────────────</w:t>
+      </w:r>
+    </w:p>
+    <w:p/>
+    <w:p>
+      <w:r>
+        <w:t>Quelque part en orbite lunaire basse, le vaisseau Babylon effectue sa dernière révolution autour du Shackleton avant le retour sur Terre.</w:t>
+      </w:r>
+    </w:p>
+    <w:p/>
+    <w:p>
+      <w:r>
+        <w:t>À son bord, une IA de navigation surveille le flux de données géospatiales. Sur les écrans, la surface lunaire défile en tuiles 3D — altimétrie laser, imagerie multispectrale, modèles de terrains acquis par les missions LROC et SELENE. L'IA ne voit pas des images. Elle voit des coordonnées, des altitudes, des vecteurs normaux. Elle navigue dans un espace de données.</w:t>
+      </w:r>
+    </w:p>
+    <w:p>
+      <w:r>
+        <w:t xml:space="preserve">Ce livre raconte comment construire cet espace. Pas pour un vaisseau spatial — pour votre navigateur web. Avec </w:t>
+      </w:r>
+      <w:proofErr w:type="spellStart"/>
+      <w:r>
+        <w:t>BabylonJS</w:t>
+      </w:r>
+      <w:proofErr w:type="spellEnd"/>
+      <w:r>
+        <w:t>, des données géospatiales réelles, et un protocole qui permet à un LLM de piloter le tout en langage naturel.</w:t>
+      </w:r>
+    </w:p>
+    <w:p/>
+    <w:p>
+      <w:pPr>
+        <w:pStyle w:val="Titre2"/>
+      </w:pPr>
+      <w:r>
+        <w:t>Ce que vous allez construire</w:t>
+      </w:r>
+    </w:p>
+    <w:p>
+      <w:r>
+        <w:t xml:space="preserve">Une interface 3D géospatiale pilotée par IA. Concrètement : une scène </w:t>
+      </w:r>
+      <w:proofErr w:type="spellStart"/>
+      <w:r>
+        <w:t>BabylonJS</w:t>
+      </w:r>
+      <w:proofErr w:type="spellEnd"/>
+      <w:r>
+        <w:t xml:space="preserve"> qui charge des données terrain réelles (DEM, tuiles 3D, métadonnées OSM), exposée à un LLM via le Model </w:t>
+      </w:r>
+      <w:proofErr w:type="spellStart"/>
+      <w:r>
+        <w:t>Context</w:t>
+      </w:r>
+      <w:proofErr w:type="spellEnd"/>
+      <w:r>
+        <w:t xml:space="preserve"> Protocol. L'opérateur tape « survole la base lunaire de Shackleton à 500 mètres d'altitude » — la caméra se déplace.</w:t>
+      </w:r>
+    </w:p>
+    <w:p>
+      <w:r>
+        <w:t xml:space="preserve">Le LLM n'a pas accès au moteur 3D. Il ne voit pas la scène. Il reçoit une grammaire — un ensemble de </w:t>
+      </w:r>
+      <w:proofErr w:type="spellStart"/>
+      <w:r>
+        <w:t>tools</w:t>
+      </w:r>
+      <w:proofErr w:type="spellEnd"/>
+      <w:r>
+        <w:t xml:space="preserve"> et </w:t>
+      </w:r>
+      <w:proofErr w:type="spellStart"/>
+      <w:r>
+        <w:t>resources</w:t>
+      </w:r>
+      <w:proofErr w:type="spellEnd"/>
+      <w:r>
+        <w:t xml:space="preserve"> MCP — et il l'utilise pour traduire des intentions en opérations concrètes. C'est cette grammaire que vous allez écrire.</w:t>
+      </w:r>
+    </w:p>
+    <w:p/>
+    <w:p>
+      <w:pPr>
+        <w:pStyle w:val="Titre2"/>
+      </w:pPr>
+      <w:r>
+        <w:t>L'implémentation réelle</w:t>
+      </w:r>
+    </w:p>
+    <w:p>
+      <w:r>
+        <w:t xml:space="preserve">Ce livre s'ancre dans une implémentation open source existante : </w:t>
+      </w:r>
+      <w:proofErr w:type="spellStart"/>
+      <w:r>
+        <w:t>mcp</w:t>
+      </w:r>
+      <w:proofErr w:type="spellEnd"/>
+      <w:r>
+        <w:t>-for-</w:t>
+      </w:r>
+      <w:proofErr w:type="spellStart"/>
+      <w:r>
+        <w:t>babylon</w:t>
+      </w:r>
+      <w:proofErr w:type="spellEnd"/>
+      <w:r>
+        <w:t xml:space="preserve"> (github.com/</w:t>
+      </w:r>
+      <w:proofErr w:type="spellStart"/>
+      <w:r>
+        <w:t>pandaGaume</w:t>
+      </w:r>
+      <w:proofErr w:type="spellEnd"/>
+      <w:r>
+        <w:t>/</w:t>
+      </w:r>
+      <w:proofErr w:type="spellStart"/>
+      <w:r>
+        <w:t>mcp</w:t>
+      </w:r>
+      <w:proofErr w:type="spellEnd"/>
+      <w:r>
+        <w:t>-for-</w:t>
+      </w:r>
+      <w:proofErr w:type="spellStart"/>
+      <w:r>
+        <w:t>babylon</w:t>
+      </w:r>
+      <w:proofErr w:type="spellEnd"/>
+      <w:r>
+        <w:t>, Apache 2.0). Nous lisons le code, nous en comprenons l'architecture, et nous l'étendons au domaine géospatial.</w:t>
+      </w:r>
+    </w:p>
+    <w:p>
+      <w:r>
+        <w:t xml:space="preserve">La phrase centrale du livre : le LLM est le </w:t>
+      </w:r>
+      <w:proofErr w:type="spellStart"/>
+      <w:r>
+        <w:t>parser</w:t>
+      </w:r>
+      <w:proofErr w:type="spellEnd"/>
+      <w:r>
+        <w:t>. Vous écrivez la grammaire.</w:t>
+      </w:r>
+    </w:p>
+    <w:p/>
+    <w:p>
+      <w:pPr>
+        <w:pStyle w:val="Titre2"/>
+      </w:pPr>
+      <w:r>
+        <w:t>Structure du livre</w:t>
+      </w:r>
+    </w:p>
+    <w:p>
+      <w:r>
+        <w:t xml:space="preserve">Partie I — Fondations : les données géospatiales (ch.1), </w:t>
+      </w:r>
+      <w:proofErr w:type="spellStart"/>
+      <w:r>
+        <w:t>BabylonJS</w:t>
+      </w:r>
+      <w:proofErr w:type="spellEnd"/>
+      <w:r>
+        <w:t xml:space="preserve"> comme </w:t>
+      </w:r>
+      <w:proofErr w:type="spellStart"/>
+      <w:r>
+        <w:t>canvas</w:t>
+      </w:r>
+      <w:proofErr w:type="spellEnd"/>
+      <w:r>
+        <w:t xml:space="preserve"> (ch.2), MCP comme protocole (ch.3). Partie II — Architecture </w:t>
+      </w:r>
+      <w:proofErr w:type="spellStart"/>
+      <w:r>
+        <w:t>Behavior</w:t>
+      </w:r>
+      <w:proofErr w:type="spellEnd"/>
+      <w:r>
+        <w:t xml:space="preserve">/Adapter : le browser comme serveur MCP (ch.4), le pattern </w:t>
+      </w:r>
+      <w:proofErr w:type="spellStart"/>
+      <w:r>
+        <w:t>Behavior</w:t>
+      </w:r>
+      <w:proofErr w:type="spellEnd"/>
+      <w:r>
+        <w:t xml:space="preserve"> (ch.5), le pattern Adapter (ch.6). Partie III — Extension géospatiale : </w:t>
+      </w:r>
+      <w:proofErr w:type="spellStart"/>
+      <w:r>
+        <w:t>TerrainBehavior</w:t>
+      </w:r>
+      <w:proofErr w:type="spellEnd"/>
+      <w:r>
+        <w:t xml:space="preserve"> (ch.7), </w:t>
+      </w:r>
+      <w:proofErr w:type="spellStart"/>
+      <w:r>
+        <w:t>CesiumTerrainBehavior</w:t>
+      </w:r>
+      <w:proofErr w:type="spellEnd"/>
+      <w:r>
+        <w:t xml:space="preserve"> (ch.8), </w:t>
+      </w:r>
+      <w:proofErr w:type="spellStart"/>
+      <w:r>
+        <w:t>behaviors</w:t>
+      </w:r>
+      <w:proofErr w:type="spellEnd"/>
+      <w:r>
+        <w:t xml:space="preserve"> avancés (ch.9). Partie IV — Cas d'usage (ch.10–12).</w:t>
+      </w:r>
+    </w:p>
+    <w:p/>
+    <w:p/>
+    <w:p>
+      <w:pPr>
+        <w:rPr>
+          <w:rFonts w:eastAsia="Arial"/>
+          <w:b/>
+          <w:bCs/>
+          <w:color w:val="2E6DA4"/>
+          <w:sz w:val="20"/>
+          <w:szCs w:val="20"/>
+        </w:rPr>
+      </w:pPr>
+      <w:r>
+        <w:rPr>
+          <w:rFonts w:eastAsia="Arial"/>
+          <w:b/>
+          <w:bCs/>
+          <w:color w:val="2E6DA4"/>
+          <w:sz w:val="20"/>
+          <w:szCs w:val="20"/>
+        </w:rPr>
+        <w:t>── EN — English</w:t>
+      </w:r>
+    </w:p>
+    <w:p>
+      <w:r>
+        <w:t>─────────────────────────────────────────────────────</w:t>
+      </w:r>
+    </w:p>
+    <w:p/>
+    <w:p>
+      <w:proofErr w:type="spellStart"/>
+      <w:r>
         <w:t>Somewhere</w:t>
       </w:r>
       <w:proofErr w:type="spellEnd"/>
       <w:r>
-        <w:rPr>
-          <w:i/>
-          <w:iCs/>
-          <w:color w:val="444444"/>
-        </w:rPr>
         <w:t xml:space="preserve"> in </w:t>
       </w:r>
       <w:proofErr w:type="spellStart"/>
       <w:r>
-        <w:rPr>
-          <w:i/>
-          <w:iCs/>
-          <w:color w:val="444444"/>
-        </w:rPr>
         <w:t>low</w:t>
       </w:r>
       <w:proofErr w:type="spellEnd"/>
       <w:r>
-        <w:rPr>
-          <w:i/>
-          <w:iCs/>
-          <w:color w:val="444444"/>
-        </w:rPr>
         <w:t xml:space="preserve"> </w:t>
       </w:r>
       <w:proofErr w:type="spellStart"/>
       <w:r>
-        <w:rPr>
-          <w:i/>
-          <w:iCs/>
-          <w:color w:val="444444"/>
-        </w:rPr>
         <w:t>lunar</w:t>
       </w:r>
       <w:proofErr w:type="spellEnd"/>
       <w:r>
-        <w:rPr>
-          <w:i/>
-          <w:iCs/>
-          <w:color w:val="444444"/>
-        </w:rPr>
         <w:t xml:space="preserve"> </w:t>
       </w:r>
       <w:proofErr w:type="spellStart"/>
       <w:r>
-        <w:rPr>
-          <w:i/>
-          <w:iCs/>
-          <w:color w:val="444444"/>
-        </w:rPr>
         <w:t>orbit</w:t>
       </w:r>
       <w:proofErr w:type="spellEnd"/>
       <w:r>
-        <w:rPr>
-          <w:i/>
-          <w:iCs/>
-          <w:color w:val="444444"/>
-        </w:rPr>
         <w:t xml:space="preserve">, the </w:t>
       </w:r>
       <w:proofErr w:type="spellStart"/>
       <w:r>
-        <w:rPr>
-          <w:i/>
-          <w:iCs/>
-          <w:color w:val="444444"/>
-        </w:rPr>
         <w:t>vessel</w:t>
       </w:r>
       <w:proofErr w:type="spellEnd"/>
       <w:r>
-        <w:rPr>
-          <w:i/>
-          <w:iCs/>
-          <w:color w:val="444444"/>
-        </w:rPr>
         <w:t xml:space="preserve"> Babylon </w:t>
       </w:r>
       <w:proofErr w:type="spellStart"/>
       <w:r>
-        <w:rPr>
-          <w:i/>
-          <w:iCs/>
-          <w:color w:val="444444"/>
-        </w:rPr>
         <w:t>completes</w:t>
       </w:r>
       <w:proofErr w:type="spellEnd"/>
       <w:r>
-        <w:rPr>
-          <w:i/>
-          <w:iCs/>
-          <w:color w:val="444444"/>
-        </w:rPr>
         <w:t xml:space="preserve"> </w:t>
       </w:r>
       <w:proofErr w:type="spellStart"/>
       <w:r>
-        <w:rPr>
-          <w:i/>
-          <w:iCs/>
-          <w:color w:val="444444"/>
-        </w:rPr>
         <w:t>its</w:t>
       </w:r>
       <w:proofErr w:type="spellEnd"/>
       <w:r>
-        <w:rPr>
-          <w:i/>
-          <w:iCs/>
-          <w:color w:val="444444"/>
-        </w:rPr>
         <w:t xml:space="preserve"> final </w:t>
       </w:r>
       <w:proofErr w:type="spellStart"/>
       <w:r>
-        <w:rPr>
-          <w:i/>
-          <w:iCs/>
-          <w:color w:val="444444"/>
-        </w:rPr>
         <w:t>revolution</w:t>
       </w:r>
       <w:proofErr w:type="spellEnd"/>
       <w:r>
-        <w:rPr>
-          <w:i/>
-          <w:iCs/>
-          <w:color w:val="444444"/>
-        </w:rPr>
         <w:t xml:space="preserve"> </w:t>
       </w:r>
       <w:proofErr w:type="spellStart"/>
       <w:r>
-        <w:rPr>
-          <w:i/>
-          <w:iCs/>
-          <w:color w:val="444444"/>
-        </w:rPr>
         <w:t>around</w:t>
       </w:r>
       <w:proofErr w:type="spellEnd"/>
       <w:r>
-        <w:rPr>
-          <w:i/>
-          <w:iCs/>
-          <w:color w:val="444444"/>
-        </w:rPr>
         <w:t xml:space="preserve"> Shackleton </w:t>
       </w:r>
       <w:proofErr w:type="spellStart"/>
       <w:r>
-        <w:rPr>
-          <w:i/>
-          <w:iCs/>
-          <w:color w:val="444444"/>
-        </w:rPr>
         <w:t>before</w:t>
       </w:r>
       <w:proofErr w:type="spellEnd"/>
       <w:r>
-        <w:rPr>
-          <w:i/>
-          <w:iCs/>
-          <w:color w:val="444444"/>
-        </w:rPr>
         <w:t xml:space="preserve"> the return to Earth.</w:t>
       </w:r>
     </w:p>
-    <w:p>
-      <w:pPr>
-        <w:spacing w:before="60"/>
-      </w:pPr>
-    </w:p>
-    <w:p>
-      <w:pPr>
-        <w:spacing w:after="180"/>
+    <w:p/>
+    <w:p>
+      <w:pPr>
         <w:rPr>
           <w:lang w:val="en-US"/>
         </w:rPr>
@@ -674,7 +460,6 @@
     </w:p>
     <w:p>
       <w:pPr>
-        <w:spacing w:after="180"/>
         <w:rPr>
           <w:lang w:val="en-US"/>
         </w:rPr>
@@ -702,7 +487,6 @@
     </w:p>
     <w:p>
       <w:pPr>
-        <w:spacing w:before="120"/>
         <w:rPr>
           <w:lang w:val="en-US"/>
         </w:rPr>
@@ -724,7 +508,6 @@
     </w:p>
     <w:p>
       <w:pPr>
-        <w:spacing w:after="180"/>
         <w:rPr>
           <w:lang w:val="en-US"/>
         </w:rPr>
@@ -766,7 +549,6 @@
     </w:p>
     <w:p>
       <w:pPr>
-        <w:spacing w:after="180"/>
         <w:rPr>
           <w:lang w:val="en-US"/>
         </w:rPr>
@@ -780,7 +562,6 @@
     </w:p>
     <w:p>
       <w:pPr>
-        <w:spacing w:before="120"/>
         <w:rPr>
           <w:lang w:val="en-US"/>
         </w:rPr>
@@ -802,7 +583,110 @@
     </w:p>
     <w:p>
       <w:pPr>
-        <w:spacing w:after="180"/>
+        <w:rPr>
+          <w:lang w:val="en-US"/>
+        </w:rPr>
+      </w:pPr>
+      <w:r>
+        <w:rPr>
+          <w:lang w:val="en-US"/>
+        </w:rPr>
+        <w:t xml:space="preserve">This book is anchored in an existing open-source implementation: </w:t>
+      </w:r>
+      <w:proofErr w:type="spellStart"/>
+      <w:r>
+        <w:rPr>
+          <w:lang w:val="en-US"/>
+        </w:rPr>
+        <w:t>mcp</w:t>
+      </w:r>
+      <w:proofErr w:type="spellEnd"/>
+      <w:r>
+        <w:rPr>
+          <w:lang w:val="en-US"/>
+        </w:rPr>
+        <w:t>-for-</w:t>
+      </w:r>
+      <w:proofErr w:type="spellStart"/>
+      <w:r>
+        <w:rPr>
+          <w:lang w:val="en-US"/>
+        </w:rPr>
+        <w:t>babylon</w:t>
+      </w:r>
+      <w:proofErr w:type="spellEnd"/>
+      <w:r>
+        <w:rPr>
+          <w:lang w:val="en-US"/>
+        </w:rPr>
+        <w:t xml:space="preserve"> (github.com/</w:t>
+      </w:r>
+      <w:proofErr w:type="spellStart"/>
+      <w:r>
+        <w:rPr>
+          <w:lang w:val="en-US"/>
+        </w:rPr>
+        <w:t>pandaGaume</w:t>
+      </w:r>
+      <w:proofErr w:type="spellEnd"/>
+      <w:r>
+        <w:rPr>
+          <w:lang w:val="en-US"/>
+        </w:rPr>
+        <w:t>/</w:t>
+      </w:r>
+      <w:proofErr w:type="spellStart"/>
+      <w:r>
+        <w:rPr>
+          <w:lang w:val="en-US"/>
+        </w:rPr>
+        <w:t>mcp</w:t>
+      </w:r>
+      <w:proofErr w:type="spellEnd"/>
+      <w:r>
+        <w:rPr>
+          <w:lang w:val="en-US"/>
+        </w:rPr>
+        <w:t>-for-</w:t>
+      </w:r>
+      <w:proofErr w:type="spellStart"/>
+      <w:r>
+        <w:rPr>
+          <w:lang w:val="en-US"/>
+        </w:rPr>
+        <w:t>babylon</w:t>
+      </w:r>
+      <w:proofErr w:type="spellEnd"/>
+      <w:r>
+        <w:rPr>
+          <w:lang w:val="en-US"/>
+        </w:rPr>
+        <w:t>, Apache 2.0). We read the code, understand its architecture, and extend it to the geospatial domain.</w:t>
+      </w:r>
+    </w:p>
+    <w:p>
+      <w:pPr>
+        <w:rPr>
+          <w:lang w:val="en-US"/>
+        </w:rPr>
+      </w:pPr>
+      <w:r>
+        <w:rPr>
+          <w:lang w:val="en-US"/>
+        </w:rPr>
+        <w:t>The book's central sentence: the LLM is the parser. You write the grammar.</w:t>
+      </w:r>
+    </w:p>
+    <w:p>
+      <w:pPr>
+        <w:rPr>
+          <w:lang w:val="en-US"/>
+        </w:rPr>
+      </w:pPr>
+    </w:p>
+    <w:p>
+      <w:pPr>
+        <w:pStyle w:val="Titre2"/>
         <w:rPr>
           <w:lang w:val="en-US"/>
         </w:rPr>
@@ -812,119 +696,10 @@
           <w:lang w:val="en-US"/>
         </w:rPr>
         <w:lastRenderedPageBreak/>
-        <w:t xml:space="preserve">This book is anchored in an existing open-source implementation: </w:t>
-      </w:r>
-      <w:proofErr w:type="spellStart"/>
-      <w:r>
-        <w:rPr>
-          <w:lang w:val="en-US"/>
-        </w:rPr>
-        <w:t>mcp</w:t>
-      </w:r>
-      <w:proofErr w:type="spellEnd"/>
-      <w:r>
-        <w:rPr>
-          <w:lang w:val="en-US"/>
-        </w:rPr>
-        <w:t>-for-</w:t>
-      </w:r>
-      <w:proofErr w:type="spellStart"/>
-      <w:r>
-        <w:rPr>
-          <w:lang w:val="en-US"/>
-        </w:rPr>
-        <w:t>babylon</w:t>
-      </w:r>
-      <w:proofErr w:type="spellEnd"/>
-      <w:r>
-        <w:rPr>
-          <w:lang w:val="en-US"/>
-        </w:rPr>
-        <w:t xml:space="preserve"> (github.com/</w:t>
-      </w:r>
-      <w:proofErr w:type="spellStart"/>
-      <w:r>
-        <w:rPr>
-          <w:lang w:val="en-US"/>
-        </w:rPr>
-        <w:t>pandaGaume</w:t>
-      </w:r>
-      <w:proofErr w:type="spellEnd"/>
-      <w:r>
-        <w:rPr>
-          <w:lang w:val="en-US"/>
-        </w:rPr>
-        <w:t>/</w:t>
-      </w:r>
-      <w:proofErr w:type="spellStart"/>
-      <w:r>
-        <w:rPr>
-          <w:lang w:val="en-US"/>
-        </w:rPr>
-        <w:t>mcp</w:t>
-      </w:r>
-      <w:proofErr w:type="spellEnd"/>
-      <w:r>
-        <w:rPr>
-          <w:lang w:val="en-US"/>
-        </w:rPr>
-        <w:t>-for-</w:t>
-      </w:r>
-      <w:proofErr w:type="spellStart"/>
-      <w:r>
-        <w:rPr>
-          <w:lang w:val="en-US"/>
-        </w:rPr>
-        <w:t>babylon</w:t>
-      </w:r>
-      <w:proofErr w:type="spellEnd"/>
-      <w:r>
-        <w:rPr>
-          <w:lang w:val="en-US"/>
-        </w:rPr>
-        <w:t>, Apache 2.0). We read the code, understand its architecture, and extend it to the geospatial domain.</w:t>
-      </w:r>
-    </w:p>
-    <w:p>
-      <w:pPr>
-        <w:spacing w:after="180"/>
-        <w:rPr>
-          <w:lang w:val="en-US"/>
-        </w:rPr>
-      </w:pPr>
-      <w:r>
-        <w:rPr>
-          <w:lang w:val="en-US"/>
-        </w:rPr>
-        <w:t>The book's central sentence: the LLM is the parser. You write the grammar.</w:t>
-      </w:r>
-    </w:p>
-    <w:p>
-      <w:pPr>
-        <w:spacing w:before="120"/>
-        <w:rPr>
-          <w:lang w:val="en-US"/>
-        </w:rPr>
-      </w:pPr>
-    </w:p>
-    <w:p>
-      <w:pPr>
-        <w:pStyle w:val="Titre2"/>
-        <w:rPr>
-          <w:lang w:val="en-US"/>
-        </w:rPr>
-      </w:pPr>
-      <w:r>
-        <w:rPr>
-          <w:lang w:val="en-US"/>
-        </w:rPr>
         <w:t>Book Structure</w:t>
       </w:r>
     </w:p>
     <w:p>
-      <w:pPr>
-        <w:spacing w:after="180"/>
-      </w:pPr>
       <w:r>
         <w:rPr>
           <w:lang w:val="en-US"/>
@@ -1479,6 +1254,16 @@
   <w:style w:type="paragraph" w:default="1" w:styleId="Normal">
     <w:name w:val="Normal"/>
     <w:qFormat/>
+    <w:rsid w:val="00077614"/>
+    <w:pPr>
+      <w:spacing w:after="180" w:line="360" w:lineRule="auto"/>
+      <w:jc w:val="both"/>
+    </w:pPr>
+    <w:rPr>
+      <w:rFonts w:ascii="Arial" w:hAnsi="Arial" w:cs="Arial"/>
+      <w:sz w:val="24"/>
+      <w:szCs w:val="24"/>
+    </w:rPr>
   </w:style>
   <w:style w:type="paragraph" w:styleId="Titre1">
     <w:name w:val="heading 1"/>
@@ -1574,7 +1359,6 @@
   <w:style w:type="character" w:default="1" w:styleId="Policepardfaut">
     <w:name w:val="Default Paragraph Font"/>
     <w:uiPriority w:val="1"/>
-    <w:semiHidden/>
     <w:unhideWhenUsed/>
   </w:style>
   <w:style w:type="table" w:default="1" w:styleId="TableauNormal">

</xml_diff>